<commit_message>
Replace resume download with latest uploaded version
</commit_message>
<xml_diff>
--- a/assets/Subhasree-Babu-Resume.docx
+++ b/assets/Subhasree-Babu-Resume.docx
@@ -69,7 +69,19 @@
           <w:rPr>
             <w:rStyle w:val="Hyperlink"/>
           </w:rPr>
-          <w:t>Portfolio</w:t>
+          <w:t>Po</w:t>
+        </w:r>
+        <w:r>
+          <w:rPr>
+            <w:rStyle w:val="Hyperlink"/>
+          </w:rPr>
+          <w:t>r</w:t>
+        </w:r>
+        <w:r>
+          <w:rPr>
+            <w:rStyle w:val="Hyperlink"/>
+          </w:rPr>
+          <w:t>tfolio</w:t>
         </w:r>
       </w:hyperlink>
     </w:p>
@@ -537,10 +549,118 @@
           </w:p>
           <w:p>
             <w:r>
-              <w:t>April 2024 - Presen</w:t>
+              <w:t xml:space="preserve">April 2024 </w:t>
+            </w:r>
+            <w:r>
+              <w:t>–</w:t>
+            </w:r>
+            <w:r>
+              <w:t xml:space="preserve"> Presen</w:t>
             </w:r>
             <w:r>
               <w:t>t</w:t>
+            </w:r>
+            <w:r>
+              <w:tab/>
+            </w:r>
+          </w:p>
+          <w:p>
+            <w:r>
+              <w:t xml:space="preserve">●  </w:t>
+            </w:r>
+            <w:r>
+              <w:t xml:space="preserve">  </w:t>
+            </w:r>
+            <w:r>
+              <w:t>Delivered excellent customer service in a fast-paced retail environment.</w:t>
+            </w:r>
+          </w:p>
+          <w:p>
+            <w:r>
+              <w:t>●</w:t>
+            </w:r>
+            <w:r>
+              <w:t xml:space="preserve">    </w:t>
+            </w:r>
+            <w:r>
+              <w:t>Developed strong teamwork and communication skills through daily customer interactions.</w:t>
+            </w:r>
+          </w:p>
+          <w:p>
+            <w:r>
+              <w:t>●</w:t>
+            </w:r>
+            <w:r>
+              <w:t xml:space="preserve">     </w:t>
+            </w:r>
+            <w:r>
+              <w:t>Managed multiple responsibilities efficiently while maintaining high operational standards.</w:t>
+            </w:r>
+          </w:p>
+          <w:p>
+            <w:r>
+              <w:t xml:space="preserve">●  </w:t>
+            </w:r>
+            <w:r>
+              <w:t xml:space="preserve">   </w:t>
+            </w:r>
+            <w:r>
+              <w:t>Demonstrated adaptability, problem-solving, and time management in a busy workplace</w:t>
+            </w:r>
+          </w:p>
+          <w:p>
+            <w:r>
+              <w:t>●</w:t>
+            </w:r>
+            <w:r>
+              <w:t xml:space="preserve">     </w:t>
+            </w:r>
+            <w:r>
+              <w:t>Collaborated with colleagues to ensure smooth day-to-day operations.</w:t>
+            </w:r>
+          </w:p>
+          <w:p>
+            <w:pPr>
+              <w:rPr>
+                <w:b/>
+                <w:bCs/>
+              </w:rPr>
+            </w:pPr>
+            <w:r>
+              <w:rPr>
+                <w:b/>
+                <w:bCs/>
+              </w:rPr>
+              <w:t>IT and System Support Intern</w:t>
+            </w:r>
+          </w:p>
+          <w:p>
+            <w:r>
+              <w:t>TVS Motors -   Karaikal, Pondicherry, India</w:t>
+            </w:r>
+            <w:r>
+              <w:tab/>
+              <w:t xml:space="preserve">                                                                                                                                                    </w:t>
+            </w:r>
+          </w:p>
+          <w:p>
+            <w:r>
+              <w:t>June-August 2022</w:t>
+            </w:r>
+          </w:p>
+          <w:p>
+            <w:r>
+              <w:t>●      Provided technical assistance for showroom systems, software, and internal tools</w:t>
+            </w:r>
+          </w:p>
+          <w:p>
+            <w:r>
+              <w:t>●      Assisted in maintaining digital records, inventory systems, and operational databases</w:t>
+            </w:r>
+          </w:p>
+          <w:p>
+            <w:r>
+              <w:t>●      Helped analyse and organise business data using spreadsheets and reporting tools</w:t>
             </w:r>
           </w:p>
         </w:tc>
@@ -676,188 +796,9 @@
           </w:p>
         </w:tc>
       </w:tr>
-      <w:tr>
-        <w:tc>
-          <w:tcPr>
-            <w:tcW w:w="0" w:type="auto"/>
-            <w:tcBorders>
-              <w:top w:val="none" w:sz="0" w:space="0" w:color="FFFFFF"/>
-              <w:left w:val="none" w:sz="0" w:space="0" w:color="FFFFFF"/>
-              <w:bottom w:val="none" w:sz="0" w:space="0" w:color="FFFFFF"/>
-              <w:right w:val="none" w:sz="0" w:space="0" w:color="FFFFFF"/>
-            </w:tcBorders>
-          </w:tcPr>
-          <w:p>
-            <w:pPr>
-              <w:rPr>
-                <w:b/>
-                <w:bCs/>
-              </w:rPr>
-            </w:pPr>
-          </w:p>
-        </w:tc>
-        <w:tc>
-          <w:tcPr>
-            <w:tcW w:w="0" w:type="auto"/>
-            <w:tcBorders>
-              <w:top w:val="none" w:sz="0" w:space="0" w:color="FFFFFF"/>
-              <w:left w:val="none" w:sz="0" w:space="0" w:color="FFFFFF"/>
-              <w:bottom w:val="none" w:sz="0" w:space="0" w:color="FFFFFF"/>
-              <w:right w:val="none" w:sz="0" w:space="0" w:color="FFFFFF"/>
-            </w:tcBorders>
-          </w:tcPr>
-          <w:p>
-            <w:pPr>
-              <w:jc w:val="right"/>
-            </w:pPr>
-          </w:p>
-        </w:tc>
-      </w:tr>
     </w:tbl>
     <w:p>
-      <w:pPr>
-        <w:tabs>
-          <w:tab w:val="left" w:pos="360"/>
-        </w:tabs>
-      </w:pPr>
-      <w:r>
-        <w:t xml:space="preserve"/>
-      </w:r>
-      <w:r>
-        <w:t>Delivered excellent customer service in a fast-paced retail environment.</w:t>
-      </w:r>
-    </w:p>
-    <w:p>
-      <w:pPr>
-        <w:tabs>
-          <w:tab w:val="left" w:pos="360"/>
-        </w:tabs>
-        <w:ind w:left="360" w:hanging="360"/>
-      </w:pPr>
-      <w:r>
-        <w:t>●</w:t>
-      </w:r>
-      <w:r>
-        <w:tab/>
-        <w:t>Developed strong teamwork and communication skills through daily customer interactions.</w:t>
-      </w:r>
-    </w:p>
-    <w:p>
-      <w:pPr>
-        <w:tabs>
-          <w:tab w:val="left" w:pos="360"/>
-        </w:tabs>
-        <w:ind w:left="360" w:hanging="360"/>
-      </w:pPr>
-      <w:r>
-        <w:t>●</w:t>
-      </w:r>
-      <w:r>
-        <w:tab/>
-        <w:t>Managed multiple responsibilities efficiently while maintaining high operational standards.</w:t>
-      </w:r>
-    </w:p>
-    <w:p>
-      <w:pPr>
-        <w:tabs>
-          <w:tab w:val="left" w:pos="360"/>
-        </w:tabs>
-        <w:ind w:left="360" w:hanging="360"/>
-      </w:pPr>
-      <w:r>
-        <w:t>●</w:t>
-      </w:r>
-      <w:r>
-        <w:tab/>
-        <w:t>Demonstrated adaptability, problem-solving, and time management in a busy workplace</w:t>
-      </w:r>
-    </w:p>
-    <w:p>
-      <w:pPr>
-        <w:tabs>
-          <w:tab w:val="left" w:pos="360"/>
-        </w:tabs>
-        <w:ind w:left="360" w:hanging="360"/>
-      </w:pPr>
-      <w:r>
-        <w:t>●</w:t>
-      </w:r>
-      <w:r>
-        <w:tab/>
-        <w:t>Collaborated with colleagues to ensure smooth day-to-day operations.</w:t>
-      </w:r>
-    </w:p>
-    <w:p>
-      <w:pPr>
-        <w:rPr>
-          <w:b/>
-          <w:bCs/>
-        </w:rPr>
-      </w:pPr>
-      <w:r>
-        <w:rPr>
-          <w:b/>
-          <w:bCs/>
-        </w:rPr>
-        <w:t>IT and System Support Intern</w:t>
-      </w:r>
-    </w:p>
-    <w:p>
-      <w:r>
-        <w:t>TVS Motors</w:t>
-      </w:r>
-      <w:r>
-        <w:t xml:space="preserve"> - </w:t>
-      </w:r>
-      <w:r>
-        <w:t xml:space="preserve">  Karaikal, Pondicherry, India</w:t>
-      </w:r>
-      <w:r>
-        <w:tab/>
-        <w:t xml:space="preserve">                                                                                                                                                    </w:t>
-      </w:r>
-    </w:p>
-    <w:p>
-      <w:r>
-        <w:t>June-August 2022</w:t>
-      </w:r>
-    </w:p>
-    <w:p>
-      <w:r>
-        <w:t>●</w:t>
-      </w:r>
-      <w:r>
-        <w:t xml:space="preserve">      </w:t>
-      </w:r>
-      <w:r>
-        <w:t>Provided technical assistance for showroom systems, software, and internal tools</w:t>
-      </w:r>
-    </w:p>
-    <w:p>
-      <w:r>
-        <w:t>●</w:t>
-      </w:r>
-      <w:r>
-        <w:t xml:space="preserve">      </w:t>
-      </w:r>
-      <w:r>
-        <w:t>Assisted in maintaining digital records, inventory systems, and operational databases</w:t>
-      </w:r>
-    </w:p>
-    <w:p>
-      <w:r>
-        <w:t>●</w:t>
-      </w:r>
-      <w:r>
-        <w:t xml:space="preserve">      </w:t>
-      </w:r>
-      <w:r>
-        <w:t>Helped analyse and organise business data using spreadsheets and reporting tools</w:t>
-      </w:r>
-    </w:p>
-    <w:p>
-      <w:r>
-        <w:lastRenderedPageBreak/>
+      <w:r>
         <w:t>●</w:t>
       </w:r>
       <w:r>
@@ -1565,7 +1506,7 @@
           </mc:Choice>
           <mc:Fallback>
             <w:pict>
-              <v:line w14:anchorId="34C661AA" id="Straight Connector 2" o:spid="_x0000_s1026" style="position:absolute;z-index:251658240;visibility:visible;mso-wrap-style:square;mso-wrap-distance-left:9pt;mso-wrap-distance-top:0;mso-wrap-distance-right:9pt;mso-wrap-distance-bottom:0;mso-position-horizontal:absolute;mso-position-horizontal-relative:text;mso-position-vertical:absolute;mso-position-vertical-relative:text" from="-19.8pt,8.3pt" to="533.4pt,8.3pt" o:gfxdata="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" strokecolor="black [3213]" strokeweight=".5pt">
+              <v:line w14:anchorId="59125BB2" id="Straight Connector 2" o:spid="_x0000_s1026" style="position:absolute;z-index:251658240;visibility:visible;mso-wrap-style:square;mso-wrap-distance-left:9pt;mso-wrap-distance-top:0;mso-wrap-distance-right:9pt;mso-wrap-distance-bottom:0;mso-position-horizontal:absolute;mso-position-horizontal-relative:text;mso-position-vertical:absolute;mso-position-vertical-relative:text" from="-19.8pt,8.3pt" to="533.4pt,8.3pt" o:gfxdata="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" strokecolor="black [3213]" strokeweight=".5pt">
                 <v:stroke joinstyle="miter"/>
               </v:line>
             </w:pict>
@@ -2860,6 +2801,18 @@
       <w:shd w:val="clear" w:color="auto" w:fill="E1DFDD"/>
     </w:rPr>
   </w:style>
+  <w:style w:type="character" w:styleId="FollowedHyperlink">
+    <w:name w:val="FollowedHyperlink"/>
+    <w:basedOn w:val="DefaultParagraphFont"/>
+    <w:uiPriority w:val="99"/>
+    <w:semiHidden/>
+    <w:unhideWhenUsed/>
+    <w:rsid w:val="00573520"/>
+    <w:rPr>
+      <w:color w:val="954F72" w:themeColor="followedHyperlink"/>
+      <w:u w:val="single"/>
+    </w:rPr>
+  </w:style>
 </w:styles>
 </file>
 

</xml_diff>